<commit_message>
docs: record P1-06 test-harness scope decision
Append the accepted scope decision to specification section 34 and
recompute the Phase 0 manifest. Record both manifest digests and preserve
phase-0-complete as the historical acceptance tag in progress.md.

Only the specification changes among the ten frozen artifacts; all ten
checksums pass. Before/after rendering and structural verification are
recorded in the governance evidence bundle.

Refs #43.
</commit_message>
<xml_diff>
--- a/docs/project/master-specification-v1.2.docx
+++ b/docs/project/master-specification-v1.2.docx
@@ -8435,6 +8435,73 @@
             </w:pPr>
             <w:r>
               <w:t>Accepted</w:t>
+            </w:r>
+          </w:p>
+        </w:tc>
+      </w:tr>
+      <w:tr>
+        <w:tc>
+          <w:tcPr>
+            <w:tcW w:type="dxa" w:w="1529"/>
+          </w:tcPr>
+          <w:p>
+            <w:pPr>
+              <w:pStyle w:val="Compact"/>
+            </w:pPr>
+            <w:r>
+              <w:t>2026-09-11 (post-freeze decision)</w:t>
+            </w:r>
+          </w:p>
+        </w:tc>
+        <w:tc>
+          <w:tcPr>
+            <w:tcW w:type="dxa" w:w="2670"/>
+          </w:tcPr>
+          <w:p>
+            <w:pPr>
+              <w:pStyle w:val="Compact"/>
+            </w:pPr>
+            <w:r>
+              <w:t>P1-06 delivers a guarded run-unique real PostgreSQL test database, test-owned synchronous transaction fixtures, ordinary per-test outer rollback, explicit cleanup of genuinely committed state, five test markers, deterministic application clock control, coverage output, and typed attribute builders for two businesses and all three roles. Its isolation proof uses only a harness-owned scratch table and two tests that each verify absence of prior committed state, commit their own state, and verify visibility from an independent connection. Explicit committed cleanup is permitted for these harness proof tests as well as later concurrency tests. Attribute builders do not constitute persistent factories or tenant-authorization evidence. The persistent factory portion of P1-06 checkbox 2 is explicitly deferred to P2-06, after P2-01 sessions, P2-02 tenant tables, and P2-06 ORM mappings exist. P2-06 must deliver row-persisting factories and repeat isolation/cleanup evidence using real tenant rows before P2-06 and the Phase 2 gate pass. The Phase 1 gate accepts only this expressly revised P1-06 scope; no other phase obligation is relaxed. No product schema or application session infrastructure is introduced by P1-06. DBML remains the schema owner; frozen backlog text is not edited.</w:t>
+            </w:r>
+          </w:p>
+        </w:tc>
+        <w:tc>
+          <w:tcPr>
+            <w:tcW w:type="dxa" w:w="2468"/>
+          </w:tcPr>
+          <w:p>
+            <w:pPr>
+              <w:pStyle w:val="Compact"/>
+            </w:pPr>
+            <w:r>
+              <w:t>P1-06 precedes the Phase 1 gate, P2-01 application sessions/Alembic, P2-02 tenant tables, and P2-06 ORM models; its original persistent-factory interpretation cannot be met in order.</w:t>
+            </w:r>
+          </w:p>
+        </w:tc>
+        <w:tc>
+          <w:tcPr>
+            <w:tcW w:type="dxa" w:w="1753"/>
+          </w:tcPr>
+          <w:p>
+            <w:pPr>
+              <w:pStyle w:val="Compact"/>
+            </w:pPr>
+            <w:r>
+              <w:t>Early product-schema creation; wholesale database-harness deferral; leaving P1-06 incomplete; moving prerequisite Phase 2 tasks ahead of the gate.</w:t>
+            </w:r>
+          </w:p>
+        </w:tc>
+        <w:tc>
+          <w:tcPr>
+            <w:tcW w:type="dxa" w:w="1156"/>
+          </w:tcPr>
+          <w:p>
+            <w:pPr>
+              <w:pStyle w:val="Compact"/>
+            </w:pPr>
+            <w:r>
+              <w:t>Accepted by Zain</w:t>
             </w:r>
           </w:p>
         </w:tc>

</xml_diff>

<commit_message>
docs: record production configuration safety decision
Append the accepted production configuration safety decision to the
section 34 Decision Log of the master specification, and recompute the
Phase 0 manifest entry for that one file. Record the previous and new
amended manifest digests in progress.md.

Only the specification changes among the ten frozen artifacts; all ten
checksums pass. The historical phase-0-complete tag does not move. The
implementation follows in a separate pull request.

Refs #51.
</commit_message>
<xml_diff>
--- a/docs/project/master-specification-v1.2.docx
+++ b/docs/project/master-specification-v1.2.docx
@@ -8489,6 +8489,73 @@
             </w:pPr>
             <w:r>
               <w:t>Early product-schema creation; wholesale database-harness deferral; leaving P1-06 incomplete; moving prerequisite Phase 2 tasks ahead of the gate.</w:t>
+            </w:r>
+          </w:p>
+        </w:tc>
+        <w:tc>
+          <w:tcPr>
+            <w:tcW w:type="dxa" w:w="1156"/>
+          </w:tcPr>
+          <w:p>
+            <w:pPr>
+              <w:pStyle w:val="Compact"/>
+            </w:pPr>
+            <w:r>
+              <w:t>Accepted by Zain</w:t>
+            </w:r>
+          </w:p>
+        </w:tc>
+      </w:tr>
+      <w:tr>
+        <w:tc>
+          <w:tcPr>
+            <w:tcW w:type="dxa" w:w="1529"/>
+          </w:tcPr>
+          <w:p>
+            <w:pPr>
+              <w:pStyle w:val="Compact"/>
+            </w:pPr>
+            <w:r>
+              <w:t>2026-09-24 (post-freeze decision)</w:t>
+            </w:r>
+          </w:p>
+        </w:tc>
+        <w:tc>
+          <w:tcPr>
+            <w:tcW w:type="dxa" w:w="2670"/>
+          </w:tcPr>
+          <w:p>
+            <w:pPr>
+              <w:pStyle w:val="Compact"/>
+            </w:pPr>
+            <w:r>
+              <w:t>When ENVIRONMENT=production, configuration fails fast if the DATABASE_URL password is empty, shorter than 16 characters, equal to postgres, password or the URL username, or contains any PLACEHOLDER_MARKERS entry, compared case-insensitively; if LOG_LEVEL is DEBUG; or if any CORS_ALLOWED_ORIGINS entry uses http:// or a loopback host (localhost, 127.0.0.1, ::1). Errors use fixed text naming the failed rule, never contain the rejected value, and do not chain the original exception. Development, test and CI behavior is unchanged. The rule rejects known unsafe values only and does not prove that an accepted credential was generated securely. DEP-01 may revise it for managed or passwordless database authentication. Source: Phase 1 security sweep finding 2.</w:t>
+            </w:r>
+          </w:p>
+        </w:tc>
+        <w:tc>
+          <w:tcPr>
+            <w:tcW w:type="dxa" w:w="2468"/>
+          </w:tcPr>
+          <w:p>
+            <w:pPr>
+              <w:pStyle w:val="Compact"/>
+            </w:pPr>
+            <w:r>
+              <w:t>Backlog P1-03 requires production to fail fast on missing or unsafe values, but no artifact defined which database credentials, log levels, or CORS origins are unsafe. The Phase 1 security sweep measured that production settings accepted the .env.example placeholder password, postgres, LOG_LEVEL=DEBUG, and a loopback http:// CORS origin. Development, test, and CI intentionally use postgres:postgres and loopback origins, so the rule applies to production only.</w:t>
+            </w:r>
+          </w:p>
+        </w:tc>
+        <w:tc>
+          <w:tcPr>
+            <w:tcW w:type="dxa" w:w="1753"/>
+          </w:tcPr>
+          <w:p>
+            <w:pPr>
+              <w:pStyle w:val="Compact"/>
+            </w:pPr>
+            <w:r>
+              <w:t>Leave unsafe production values undefined; reject only exact placeholder values; apply the rule in every environment; require a managed secret store before any deployment.</w:t>
             </w:r>
           </w:p>
         </w:tc>

</xml_diff>

<commit_message>
docs: revise the production configuration decision row
Revise the unmerged section 34 row after the independent review of
PR #52. Define missing and query-string passwords, percent-decoded
and case-insensitive comparison, and the loopback and unspecified
host set; name DEP-02 as a possible reviser; name replace-me in the
Reason cell. Update the specification manifest digest, the #51
manifest note, and the P1-06 note label.

Refs #51.
</commit_message>
<xml_diff>
--- a/docs/project/master-specification-v1.2.docx
+++ b/docs/project/master-specification-v1.2.docx
@@ -8529,7 +8529,7 @@
               <w:pStyle w:val="Compact"/>
             </w:pPr>
             <w:r>
-              <w:t>When ENVIRONMENT=production, configuration fails fast if the DATABASE_URL password is empty, shorter than 16 characters, equal to postgres, password or the URL username, or contains any PLACEHOLDER_MARKERS entry, compared case-insensitively; if LOG_LEVEL is DEBUG; or if any CORS_ALLOWED_ORIGINS entry uses http:// or a loopback host (localhost, 127.0.0.1, ::1). Errors use fixed text naming the failed rule, never contain the rejected value, and do not chain the original exception. Development, test and CI behavior is unchanged. The rule rejects known unsafe values only and does not prove that an accepted credential was generated securely. DEP-01 may revise it for managed or passwordless database authentication. Source: Phase 1 security sweep finding 2.</w:t>
+              <w:t>When ENVIRONMENT=production, configuration fails fast if the DATABASE_URL password is missing, empty, shorter than 16 characters, equal to postgres, password or the URL username, or contains any PLACEHOLDER_MARKERS entry; if the DATABASE_URL query string contains a password parameter; if LOG_LEVEL is DEBUG; or if any CORS_ALLOWED_ORIGINS entry uses http:// or a loopback or unspecified host. The password is checked after percent-decoding, and every comparison is case-insensitive. A loopback or unspecified host is localhost or any name ending in .localhost, with or without a trailing dot, or any IP address in 127.0.0.0/8, 0.0.0.0, ::1 or ::, including IPv4-mapped IPv6 forms, compared after removing IPv6 brackets. Errors use fixed text naming the failed rule, never contain the rejected value, and do not chain the original exception. Development, test and CI behavior is unchanged. The rule rejects known unsafe values only and does not prove that an accepted credential was generated securely. DEP-01 or DEP-02 may revise it for managed or passwordless database authentication. Source: Phase 1 security sweep finding 2.</w:t>
             </w:r>
           </w:p>
         </w:tc>
@@ -8542,7 +8542,7 @@
               <w:pStyle w:val="Compact"/>
             </w:pPr>
             <w:r>
-              <w:t>Backlog P1-03 requires production to fail fast on missing or unsafe values, but no artifact defined which database credentials, log levels, or CORS origins are unsafe. The Phase 1 security sweep measured that production settings accepted the .env.example placeholder password, postgres, LOG_LEVEL=DEBUG, and a loopback http:// CORS origin. Development, test, and CI intentionally use postgres:postgres and loopback origins, so the rule applies to production only.</w:t>
+              <w:t>Backlog P1-03 requires production to fail fast on missing or unsafe values, but no artifact defined which database credentials, log levels, or CORS origins are unsafe. The Phase 1 security sweep measured that production settings accepted the .env.example placeholder password replace-me, the password postgres, LOG_LEVEL=DEBUG, and a loopback http:// CORS origin. Development, test, and CI intentionally use postgres:postgres and loopback origins, so the rule applies to production only.</w:t>
             </w:r>
           </w:p>
         </w:tc>

</xml_diff>

<commit_message>
docs: record production configuration safety decision (#52)
Record the production configuration safety decision in the section 34
Decision Log, replace only the specification digest in the Phase 0
manifest, and record the change in docs/project/progress.md.

The row was revised before merge after the independent review. It
defines missing and query-string passwords, percent-decoded and
case-insensitive comparison, and the loopback and unspecified host
set; names DEP-02 as a possible reviser; and names replace-me in the
Reason cell. The first commit rewrote every zip entry's timestamp and
create_system field; content changed only in word/document.xml.

Squashed heads: 99fc66bbed2d09ea8217823fc59f4d88218e15cb,
125793f2f8d1cb45b41ccd0b307fae5eab71f88d and
19a47d798bd20f9c9ce48138ad3fa3acb66532d6.

Refs #51.
</commit_message>
<xml_diff>
--- a/docs/project/master-specification-v1.2.docx
+++ b/docs/project/master-specification-v1.2.docx
@@ -8489,6 +8489,73 @@
             </w:pPr>
             <w:r>
               <w:t>Early product-schema creation; wholesale database-harness deferral; leaving P1-06 incomplete; moving prerequisite Phase 2 tasks ahead of the gate.</w:t>
+            </w:r>
+          </w:p>
+        </w:tc>
+        <w:tc>
+          <w:tcPr>
+            <w:tcW w:type="dxa" w:w="1156"/>
+          </w:tcPr>
+          <w:p>
+            <w:pPr>
+              <w:pStyle w:val="Compact"/>
+            </w:pPr>
+            <w:r>
+              <w:t>Accepted by Zain</w:t>
+            </w:r>
+          </w:p>
+        </w:tc>
+      </w:tr>
+      <w:tr>
+        <w:tc>
+          <w:tcPr>
+            <w:tcW w:type="dxa" w:w="1529"/>
+          </w:tcPr>
+          <w:p>
+            <w:pPr>
+              <w:pStyle w:val="Compact"/>
+            </w:pPr>
+            <w:r>
+              <w:t>2026-09-24 (post-freeze decision)</w:t>
+            </w:r>
+          </w:p>
+        </w:tc>
+        <w:tc>
+          <w:tcPr>
+            <w:tcW w:type="dxa" w:w="2670"/>
+          </w:tcPr>
+          <w:p>
+            <w:pPr>
+              <w:pStyle w:val="Compact"/>
+            </w:pPr>
+            <w:r>
+              <w:t>When ENVIRONMENT=production, configuration fails fast if the DATABASE_URL password is missing, empty, shorter than 16 characters, equal to postgres, password or the URL username, or contains any PLACEHOLDER_MARKERS entry; if the DATABASE_URL query string contains a password parameter; if LOG_LEVEL is DEBUG; or if any CORS_ALLOWED_ORIGINS entry uses http:// or a loopback or unspecified host. The password is checked after percent-decoding, and every comparison is case-insensitive. A loopback or unspecified host is localhost or any name ending in .localhost, with or without a trailing dot, or any IP address in 127.0.0.0/8, 0.0.0.0, ::1 or ::, including IPv4-mapped IPv6 forms, compared after removing IPv6 brackets. Errors use fixed text naming the failed rule, never contain the rejected value, and do not chain the original exception. Development, test and CI behavior is unchanged. The rule rejects known unsafe values only and does not prove that an accepted credential was generated securely. DEP-01 or DEP-02 may revise it for managed or passwordless database authentication. Source: Phase 1 security sweep finding 2.</w:t>
+            </w:r>
+          </w:p>
+        </w:tc>
+        <w:tc>
+          <w:tcPr>
+            <w:tcW w:type="dxa" w:w="2468"/>
+          </w:tcPr>
+          <w:p>
+            <w:pPr>
+              <w:pStyle w:val="Compact"/>
+            </w:pPr>
+            <w:r>
+              <w:t>Backlog P1-03 requires production to fail fast on missing or unsafe values, but no artifact defined which database credentials, log levels, or CORS origins are unsafe. The Phase 1 security sweep measured that production settings accepted the .env.example placeholder password replace-me, the password postgres, LOG_LEVEL=DEBUG, and a loopback http:// CORS origin. Development, test, and CI intentionally use postgres:postgres and loopback origins, so the rule applies to production only.</w:t>
+            </w:r>
+          </w:p>
+        </w:tc>
+        <w:tc>
+          <w:tcPr>
+            <w:tcW w:type="dxa" w:w="1753"/>
+          </w:tcPr>
+          <w:p>
+            <w:pPr>
+              <w:pStyle w:val="Compact"/>
+            </w:pPr>
+            <w:r>
+              <w:t>Leave unsafe production values undefined; reject only exact placeholder values; apply the rule in every environment; require a managed secret store before any deployment.</w:t>
             </w:r>
           </w:p>
         </w:tc>

</xml_diff>